<commit_message>
Solutions doc: condition then solution, one task per page, no extras
Co-Authored-By: Claude Opus 5.5 <noreply@anthropic.com>
Claude-Session: https://claude.ai/code/session_01NJoqX3NRGqC3kHLhyW7fDF
</commit_message>
<xml_diff>
--- a/Решения_задач_Дискретизация.docx
+++ b/Решения_задач_Дискретизация.docx
@@ -4,82 +4,6 @@
   <w:body>
     <w:p>
       <w:pPr>
-        <w:pStyle w:val="Title"/>
-      </w:pPr>
-      <w:r>
-        <w:t xml:space="preserve">Решение</w:t>
-      </w:r>
-      <w:r>
-        <w:t xml:space="preserve"> </w:t>
-      </w:r>
-      <w:r>
-        <w:t xml:space="preserve">задач</w:t>
-      </w:r>
-      <w:r>
-        <w:t xml:space="preserve"> </w:t>
-      </w:r>
-      <w:r>
-        <w:t xml:space="preserve">к</w:t>
-      </w:r>
-      <w:r>
-        <w:t xml:space="preserve"> </w:t>
-      </w:r>
-      <w:r>
-        <w:t xml:space="preserve">сдаче</w:t>
-      </w:r>
-      <w:r>
-        <w:t xml:space="preserve"> </w:t>
-      </w:r>
-      <w:r>
-        <w:t xml:space="preserve">работы</w:t>
-      </w:r>
-    </w:p>
-    <w:p>
-      <w:pPr>
-        <w:pStyle w:val="Subtitle"/>
-      </w:pPr>
-      <w:r>
-        <w:t xml:space="preserve">Лабораторная</w:t>
-      </w:r>
-      <w:r>
-        <w:t xml:space="preserve"> </w:t>
-      </w:r>
-      <w:r>
-        <w:t xml:space="preserve">работа</w:t>
-      </w:r>
-      <w:r>
-        <w:t xml:space="preserve"> </w:t>
-      </w:r>
-      <w:r>
-        <w:t xml:space="preserve">«Дискретизация</w:t>
-      </w:r>
-      <w:r>
-        <w:t xml:space="preserve"> </w:t>
-      </w:r>
-      <w:r>
-        <w:t xml:space="preserve">аналоговых</w:t>
-      </w:r>
-      <w:r>
-        <w:t xml:space="preserve"> </w:t>
-      </w:r>
-      <w:r>
-        <w:t xml:space="preserve">сигналов»</w:t>
-      </w:r>
-      <w:r>
-        <w:t xml:space="preserve"> </w:t>
-      </w:r>
-      <w:r>
-        <w:t xml:space="preserve">(МФТИ,</w:t>
-      </w:r>
-      <w:r>
-        <w:t xml:space="preserve"> </w:t>
-      </w:r>
-      <w:r>
-        <w:t xml:space="preserve">2024)</w:t>
-      </w:r>
-    </w:p>
-    <w:p>
-      <w:pPr>
         <w:pStyle w:val="FirstParagraph"/>
       </w:pPr>
       <w:r>
@@ -87,542 +11,27 @@
           <w:bCs/>
           <w:b/>
         </w:rPr>
-        <w:t xml:space="preserve">Принятые обозначения</w:t>
-      </w:r>
-      <w:r>
-        <w:t xml:space="preserve"> </w:t>
-      </w:r>
-      <w:r>
-        <w:t xml:space="preserve">(как в методических указаниях): преобразование Фурье</w:t>
-      </w:r>
-      <w:r>
-        <w:t xml:space="preserve"> </w:t>
-      </w:r>
-      <m:oMath>
-        <m:r>
-          <m:t>X</m:t>
-        </m:r>
-        <m:d>
-          <m:dPr>
-            <m:begChr m:val="("/>
-            <m:endChr m:val=")"/>
-            <m:sepChr m:val=""/>
-            <m:grow/>
-          </m:dPr>
-          <m:e>
-            <m:r>
-              <m:t>f</m:t>
-            </m:r>
-          </m:e>
-        </m:d>
-        <m:r>
-          <m:rPr>
-            <m:sty m:val="p"/>
-          </m:rPr>
-          <m:t>=</m:t>
-        </m:r>
-        <m:nary>
-          <m:naryPr>
-            <m:chr m:val="∫"/>
-            <m:limLoc m:val="subSup"/>
-            <m:subHide m:val="off"/>
-            <m:supHide m:val="off"/>
-          </m:naryPr>
-          <m:sub>
-            <m:r>
-              <m:rPr>
-                <m:sty m:val="p"/>
-              </m:rPr>
-              <m:t>−</m:t>
-            </m:r>
-            <m:r>
-              <m:rPr>
-                <m:sty m:val="p"/>
-              </m:rPr>
-              <m:t>∞</m:t>
-            </m:r>
-          </m:sub>
-          <m:sup>
-            <m:r>
-              <m:rPr>
-                <m:sty m:val="p"/>
-              </m:rPr>
-              <m:t>∞</m:t>
-            </m:r>
-          </m:sup>
-          <m:e>
-            <m:r>
-              <m:t>x</m:t>
-            </m:r>
-          </m:e>
-        </m:nary>
-        <m:d>
-          <m:dPr>
-            <m:begChr m:val="("/>
-            <m:endChr m:val=")"/>
-            <m:sepChr m:val=""/>
-            <m:grow/>
-          </m:dPr>
-          <m:e>
-            <m:r>
-              <m:t>t</m:t>
-            </m:r>
-          </m:e>
-        </m:d>
-        <m:sSup>
-          <m:e>
-            <m:r>
-              <m:t>e</m:t>
-            </m:r>
-          </m:e>
-          <m:sup>
-            <m:r>
-              <m:rPr>
-                <m:sty m:val="p"/>
-              </m:rPr>
-              <m:t>−</m:t>
-            </m:r>
-            <m:r>
-              <m:t>j</m:t>
-            </m:r>
-            <m:r>
-              <m:t>2</m:t>
-            </m:r>
-            <m:r>
-              <m:t>π</m:t>
-            </m:r>
-            <m:r>
-              <m:t>f</m:t>
-            </m:r>
-            <m:r>
-              <m:t>t</m:t>
-            </m:r>
-          </m:sup>
-        </m:sSup>
-        <m:r>
-          <m:t> </m:t>
-        </m:r>
-        <m:r>
-          <m:t>d</m:t>
+        <w:t xml:space="preserve">№ 1.1.</w:t>
+      </w:r>
+      <w:r>
+        <w:t xml:space="preserve"> </w:t>
+      </w:r>
+      <w:r>
+        <w:t xml:space="preserve">Имеется одноканальная (моно) аудиозапись с битовой глубиной 16 бит на отсчёт (разрядность АЦП равна 16), представленная в виде wav-файла. Частота дискретизации равна 44100 Гц. Определите число уровней квантования АЦП и шаг дискретизации</w:t>
+      </w:r>
+      <w:r>
+        <w:t xml:space="preserve"> </w:t>
+      </w:r>
+      <m:oMath>
+        <m:r>
+          <m:t>Δ</m:t>
         </m:r>
         <m:r>
           <m:t>t</m:t>
         </m:r>
       </m:oMath>
       <w:r>
-        <w:t xml:space="preserve">;</w:t>
-      </w:r>
-      <w:r>
-        <w:t xml:space="preserve"> </w:t>
-      </w:r>
-      <m:oMath>
-        <m:r>
-          <m:t>Δ</m:t>
-        </m:r>
-        <m:r>
-          <m:t>t</m:t>
-        </m:r>
-      </m:oMath>
-      <w:r>
-        <w:t xml:space="preserve"> </w:t>
-      </w:r>
-      <w:r>
-        <w:t xml:space="preserve">— шаг дискретизации,</w:t>
-      </w:r>
-      <w:r>
-        <w:t xml:space="preserve"> </w:t>
-      </w:r>
-      <m:oMath>
-        <m:sSub>
-          <m:e>
-            <m:r>
-              <m:t>f</m:t>
-            </m:r>
-          </m:e>
-          <m:sub>
-            <m:r>
-              <m:t>д</m:t>
-            </m:r>
-          </m:sub>
-        </m:sSub>
-        <m:r>
-          <m:rPr>
-            <m:sty m:val="p"/>
-          </m:rPr>
-          <m:t>=</m:t>
-        </m:r>
-        <m:r>
-          <m:t>1</m:t>
-        </m:r>
-        <m:r>
-          <m:rPr>
-            <m:sty m:val="p"/>
-          </m:rPr>
-          <m:t>/</m:t>
-        </m:r>
-        <m:r>
-          <m:t>Δ</m:t>
-        </m:r>
-        <m:r>
-          <m:t>t</m:t>
-        </m:r>
-      </m:oMath>
-      <w:r>
-        <w:t xml:space="preserve"> </w:t>
-      </w:r>
-      <w:r>
-        <w:t xml:space="preserve">— частота дискретизации; отсчёты дискретизованного сигнала</w:t>
-      </w:r>
-      <w:r>
-        <w:t xml:space="preserve"> </w:t>
-      </w:r>
-      <m:oMath>
-        <m:r>
-          <m:t>x</m:t>
-        </m:r>
-        <m:d>
-          <m:dPr>
-            <m:begChr m:val="["/>
-            <m:endChr m:val="]"/>
-            <m:sepChr m:val=""/>
-            <m:grow/>
-          </m:dPr>
-          <m:e>
-            <m:r>
-              <m:t>k</m:t>
-            </m:r>
-          </m:e>
-        </m:d>
-        <m:r>
-          <m:rPr>
-            <m:sty m:val="p"/>
-          </m:rPr>
-          <m:t>=</m:t>
-        </m:r>
-        <m:r>
-          <m:t>Δ</m:t>
-        </m:r>
-        <m:r>
-          <m:t>t</m:t>
-        </m:r>
-        <m:r>
-          <m:t> </m:t>
-        </m:r>
-        <m:r>
-          <m:t>x</m:t>
-        </m:r>
-        <m:d>
-          <m:dPr>
-            <m:begChr m:val="("/>
-            <m:endChr m:val=")"/>
-            <m:sepChr m:val=""/>
-            <m:grow/>
-          </m:dPr>
-          <m:e>
-            <m:r>
-              <m:t>k</m:t>
-            </m:r>
-            <m:r>
-              <m:t>Δ</m:t>
-            </m:r>
-            <m:r>
-              <m:t>t</m:t>
-            </m:r>
-          </m:e>
-        </m:d>
-      </m:oMath>
-      <w:r>
-        <w:t xml:space="preserve"> </w:t>
-      </w:r>
-      <w:r>
-        <w:t xml:space="preserve">(т. е.</w:t>
-      </w:r>
-      <w:r>
-        <w:t xml:space="preserve"> </w:t>
-      </w:r>
-      <m:oMath>
-        <m:r>
-          <m:rPr>
-            <m:sty m:val="p"/>
-          </m:rPr>
-          <m:t>T</m:t>
-        </m:r>
-        <m:r>
-          <m:rPr>
-            <m:sty m:val="p"/>
-          </m:rPr>
-          <m:t>=</m:t>
-        </m:r>
-        <m:r>
-          <m:t>Δ</m:t>
-        </m:r>
-        <m:r>
-          <m:t>t</m:t>
-        </m:r>
-      </m:oMath>
-      <w:r>
-        <w:t xml:space="preserve">), ДВПФ</w:t>
-      </w:r>
-      <w:r>
-        <w:t xml:space="preserve"> </w:t>
-      </w:r>
-      <m:oMath>
-        <m:sSub>
-          <m:e>
-            <m:r>
-              <m:t>X</m:t>
-            </m:r>
-          </m:e>
-          <m:sub>
-            <m:r>
-              <m:t>д</m:t>
-            </m:r>
-          </m:sub>
-        </m:sSub>
-        <m:d>
-          <m:dPr>
-            <m:begChr m:val="("/>
-            <m:endChr m:val=")"/>
-            <m:sepChr m:val=""/>
-            <m:grow/>
-          </m:dPr>
-          <m:e>
-            <m:r>
-              <m:t>f</m:t>
-            </m:r>
-          </m:e>
-        </m:d>
-        <m:r>
-          <m:rPr>
-            <m:sty m:val="p"/>
-          </m:rPr>
-          <m:t>=</m:t>
-        </m:r>
-        <m:nary>
-          <m:naryPr>
-            <m:chr m:val="∑"/>
-            <m:limLoc m:val="undOvr"/>
-            <m:subHide m:val="off"/>
-            <m:supHide m:val="on"/>
-          </m:naryPr>
-          <m:sub>
-            <m:r>
-              <m:t>k</m:t>
-            </m:r>
-          </m:sub>
-          <m:sup>
-            <m:r>
-              <m:t>​</m:t>
-            </m:r>
-          </m:sup>
-          <m:e>
-            <m:r>
-              <m:t>x</m:t>
-            </m:r>
-          </m:e>
-        </m:nary>
-        <m:d>
-          <m:dPr>
-            <m:begChr m:val="["/>
-            <m:endChr m:val="]"/>
-            <m:sepChr m:val=""/>
-            <m:grow/>
-          </m:dPr>
-          <m:e>
-            <m:r>
-              <m:t>k</m:t>
-            </m:r>
-          </m:e>
-        </m:d>
-        <m:sSup>
-          <m:e>
-            <m:r>
-              <m:t>e</m:t>
-            </m:r>
-          </m:e>
-          <m:sup>
-            <m:r>
-              <m:rPr>
-                <m:sty m:val="p"/>
-              </m:rPr>
-              <m:t>−</m:t>
-            </m:r>
-            <m:r>
-              <m:t>j</m:t>
-            </m:r>
-            <m:r>
-              <m:t>2</m:t>
-            </m:r>
-            <m:r>
-              <m:t>π</m:t>
-            </m:r>
-            <m:r>
-              <m:t>f</m:t>
-            </m:r>
-            <m:r>
-              <m:t>k</m:t>
-            </m:r>
-            <m:r>
-              <m:t>Δ</m:t>
-            </m:r>
-            <m:r>
-              <m:t>t</m:t>
-            </m:r>
-          </m:sup>
-        </m:sSup>
-      </m:oMath>
-      <w:r>
-        <w:t xml:space="preserve">. Для прямоугольного окна длительностью</w:t>
-      </w:r>
-      <w:r>
-        <w:t xml:space="preserve"> </w:t>
-      </w:r>
-      <m:oMath>
-        <m:r>
-          <m:t>τ</m:t>
-        </m:r>
-      </m:oMath>
-      <w:r>
-        <w:t xml:space="preserve">:</w:t>
-      </w:r>
-      <w:r>
-        <w:t xml:space="preserve"> </w:t>
-      </w:r>
-      <m:oMath>
-        <m:r>
-          <m:t>W</m:t>
-        </m:r>
-        <m:d>
-          <m:dPr>
-            <m:begChr m:val="("/>
-            <m:endChr m:val=")"/>
-            <m:sepChr m:val=""/>
-            <m:grow/>
-          </m:dPr>
-          <m:e>
-            <m:r>
-              <m:t>f</m:t>
-            </m:r>
-          </m:e>
-        </m:d>
-        <m:r>
-          <m:rPr>
-            <m:sty m:val="p"/>
-          </m:rPr>
-          <m:t>=</m:t>
-        </m:r>
-        <m:r>
-          <m:t>τ</m:t>
-        </m:r>
-        <m:f>
-          <m:fPr>
-            <m:type m:val="bar"/>
-          </m:fPr>
-          <m:num>
-            <m:r>
-              <m:rPr>
-                <m:sty m:val="p"/>
-              </m:rPr>
-              <m:t>sin</m:t>
-            </m:r>
-            <m:d>
-              <m:dPr>
-                <m:begChr m:val="("/>
-                <m:endChr m:val=")"/>
-                <m:sepChr m:val=""/>
-                <m:grow/>
-              </m:dPr>
-              <m:e>
-                <m:r>
-                  <m:t>π</m:t>
-                </m:r>
-                <m:r>
-                  <m:t>f</m:t>
-                </m:r>
-                <m:r>
-                  <m:t>τ</m:t>
-                </m:r>
-              </m:e>
-            </m:d>
-          </m:num>
-          <m:den>
-            <m:r>
-              <m:t>π</m:t>
-            </m:r>
-            <m:r>
-              <m:t>f</m:t>
-            </m:r>
-            <m:r>
-              <m:t>τ</m:t>
-            </m:r>
-          </m:den>
-        </m:f>
-      </m:oMath>
-      <w:r>
-        <w:t xml:space="preserve">.</w:t>
-      </w:r>
-    </w:p>
-    <w:bookmarkStart w:id="22" w:name="модуль-1"/>
-    <w:p>
-      <w:pPr>
-        <w:pageBreakBefore/>
-        <w:pStyle w:val="Heading1"/>
-      </w:pPr>
-      <w:r>
-        <w:t xml:space="preserve">Модуль 1</w:t>
-      </w:r>
-    </w:p>
-    <w:bookmarkStart w:id="20" w:name="section"/>
-    <w:p>
-      <w:pPr>
-        <w:pStyle w:val="Heading2"/>
-      </w:pPr>
-      <w:r>
-        <w:t xml:space="preserve">№ 1.1</w:t>
-      </w:r>
-    </w:p>
-    <w:p>
-      <w:pPr>
-        <w:pStyle w:val="FirstParagraph"/>
-      </w:pPr>
-      <w:r>
-        <w:rPr>
-          <w:bCs/>
-          <w:b/>
-        </w:rPr>
-        <w:t xml:space="preserve">Условие.</w:t>
-      </w:r>
-      <w:r>
-        <w:t xml:space="preserve"> </w:t>
-      </w:r>
-      <w:r>
-        <w:t xml:space="preserve">Имеется одноканальная (моно) аудиозапись с битовой глубиной 16 бит на отсчёт (разрядность АЦП равна 16), представленная в виде wav-файла. Частота дискретизации равна 44100 Гц. Определите число уровней квантования АЦП и шаг дискретизации</w:t>
-      </w:r>
-      <w:r>
-        <w:t xml:space="preserve"> </w:t>
-      </w:r>
-      <m:oMath>
-        <m:r>
-          <m:t>Δ</m:t>
-        </m:r>
-        <m:r>
-          <m:t>t</m:t>
-        </m:r>
-      </m:oMath>
-      <w:r>
         <w:t xml:space="preserve">. Оцените длительность сигнала, если объём файла составляет 280 КБ и никакое дополнительное сжатие не производится.</w:t>
-      </w:r>
-    </w:p>
-    <w:p>
-      <w:pPr>
-        <w:pStyle w:val="BodyText"/>
-      </w:pPr>
-      <w:r>
-        <w:rPr>
-          <w:bCs/>
-          <w:b/>
-        </w:rPr>
-        <w:t xml:space="preserve">Решение.</w:t>
       </w:r>
     </w:p>
     <w:p>
@@ -1373,27 +782,17 @@
         <w:t xml:space="preserve">с.</w:t>
       </w:r>
     </w:p>
-    <w:bookmarkEnd w:id="20"/>
-    <w:bookmarkStart w:id="21" w:name="section-1"/>
     <w:p>
       <w:pPr>
         <w:pageBreakBefore/>
-        <w:pStyle w:val="Heading2"/>
-      </w:pPr>
-      <w:r>
-        <w:t xml:space="preserve">№ 1.2</w:t>
-      </w:r>
-    </w:p>
-    <w:p>
-      <w:pPr>
-        <w:pStyle w:val="FirstParagraph"/>
+        <w:pStyle w:val="BodyText"/>
       </w:pPr>
       <w:r>
         <w:rPr>
           <w:bCs/>
           <w:b/>
         </w:rPr>
-        <w:t xml:space="preserve">Условие.</w:t>
+        <w:t xml:space="preserve">№ 1.2.</w:t>
       </w:r>
       <w:r>
         <w:t xml:space="preserve"> </w:t>
@@ -1802,18 +1201,6 @@
       </m:oMath>
       <w:r>
         <w:t xml:space="preserve">.</w:t>
-      </w:r>
-    </w:p>
-    <w:p>
-      <w:pPr>
-        <w:pStyle w:val="BodyText"/>
-      </w:pPr>
-      <w:r>
-        <w:rPr>
-          <w:bCs/>
-          <w:b/>
-        </w:rPr>
-        <w:t xml:space="preserve">Решение.</w:t>
       </w:r>
     </w:p>
     <w:p>
@@ -3119,29 +2506,9 @@
         </m:oMath>
       </m:oMathPara>
     </w:p>
-    <w:bookmarkEnd w:id="21"/>
-    <w:bookmarkEnd w:id="22"/>
-    <w:bookmarkStart w:id="51" w:name="модуль-2"/>
     <w:p>
       <w:pPr>
         <w:pageBreakBefore/>
-        <w:pStyle w:val="Heading1"/>
-      </w:pPr>
-      <w:r>
-        <w:t xml:space="preserve">Модуль 2</w:t>
-      </w:r>
-    </w:p>
-    <w:bookmarkStart w:id="26" w:name="section-2"/>
-    <w:p>
-      <w:pPr>
-        <w:pStyle w:val="Heading2"/>
-      </w:pPr>
-      <w:r>
-        <w:t xml:space="preserve">№ 2.1</w:t>
-      </w:r>
-    </w:p>
-    <w:p>
-      <w:pPr>
         <w:pStyle w:val="FirstParagraph"/>
       </w:pPr>
       <w:r>
@@ -3149,7 +2516,7 @@
           <w:bCs/>
           <w:b/>
         </w:rPr>
-        <w:t xml:space="preserve">Условие.</w:t>
+        <w:t xml:space="preserve">№ 2.1.</w:t>
       </w:r>
       <w:r>
         <w:t xml:space="preserve"> </w:t>
@@ -3357,18 +2724,6 @@
       </w:r>
       <w:r>
         <w:t xml:space="preserve">кГц.</w:t>
-      </w:r>
-    </w:p>
-    <w:p>
-      <w:pPr>
-        <w:pStyle w:val="BodyText"/>
-      </w:pPr>
-      <w:r>
-        <w:rPr>
-          <w:bCs/>
-          <w:b/>
-        </w:rPr>
-        <w:t xml:space="preserve">Решение.</w:t>
       </w:r>
     </w:p>
     <w:p>
@@ -4048,25 +3403,25 @@
     </w:p>
     <w:p>
       <w:pPr>
-        <w:pStyle w:val="CaptionedFigure"/>
+        <w:pStyle w:val="BodyText"/>
       </w:pPr>
       <w:r>
         <w:drawing>
           <wp:inline>
             <wp:extent cx="4859999" cy="1727999"/>
             <wp:effectExtent b="0" l="0" r="0" t="0"/>
-            <wp:docPr descr="Спектр сигнала № 2.1" title="" id="24" name="Picture"/>
+            <wp:docPr descr="" title="" id="21" name="Picture"/>
             <a:graphic>
               <a:graphicData uri="http://schemas.openxmlformats.org/drawingml/2006/picture">
                 <pic:pic>
                   <pic:nvPicPr>
-                    <pic:cNvPr descr="fig/z2_1.png" id="25" name="Picture"/>
+                    <pic:cNvPr descr="fig/z2_1.png" id="22" name="Picture"/>
                     <pic:cNvPicPr>
                       <a:picLocks noChangeArrowheads="1" noChangeAspect="1"/>
                     </pic:cNvPicPr>
                   </pic:nvPicPr>
                   <pic:blipFill>
-                    <a:blip r:embed="rId23"/>
+                    <a:blip r:embed="rId20"/>
                     <a:stretch>
                       <a:fillRect/>
                     </a:stretch>
@@ -4095,33 +3450,15 @@
     </w:p>
     <w:p>
       <w:pPr>
-        <w:pStyle w:val="ImageCaption"/>
-      </w:pPr>
-      <w:r>
-        <w:t xml:space="preserve">Спектр сигнала № 2.1</w:t>
-      </w:r>
-    </w:p>
-    <w:bookmarkEnd w:id="26"/>
-    <w:bookmarkStart w:id="30" w:name="section-3"/>
-    <w:p>
-      <w:pPr>
         <w:pageBreakBefore/>
-        <w:pStyle w:val="Heading2"/>
-      </w:pPr>
-      <w:r>
-        <w:t xml:space="preserve">№ 2.2</w:t>
-      </w:r>
-    </w:p>
-    <w:p>
-      <w:pPr>
-        <w:pStyle w:val="FirstParagraph"/>
+        <w:pStyle w:val="BodyText"/>
       </w:pPr>
       <w:r>
         <w:rPr>
           <w:bCs/>
           <w:b/>
         </w:rPr>
-        <w:t xml:space="preserve">Условие.</w:t>
+        <w:t xml:space="preserve">№ 2.2.</w:t>
       </w:r>
       <w:r>
         <w:t xml:space="preserve"> </w:t>
@@ -4282,18 +3619,6 @@
       </w:r>
       <w:r>
         <w:t xml:space="preserve">с. Найти спектр наблюдаемого участка сигнала.</w:t>
-      </w:r>
-    </w:p>
-    <w:p>
-      <w:pPr>
-        <w:pStyle w:val="BodyText"/>
-      </w:pPr>
-      <w:r>
-        <w:rPr>
-          <w:bCs/>
-          <w:b/>
-        </w:rPr>
-        <w:t xml:space="preserve">Решение.</w:t>
       </w:r>
     </w:p>
     <w:p>
@@ -5840,25 +5165,25 @@
     </w:p>
     <w:p>
       <w:pPr>
-        <w:pStyle w:val="CaptionedFigure"/>
+        <w:pStyle w:val="BodyText"/>
       </w:pPr>
       <w:r>
         <w:drawing>
           <wp:inline>
             <wp:extent cx="4859999" cy="1943999"/>
             <wp:effectExtent b="0" l="0" r="0" t="0"/>
-            <wp:docPr descr="|Y(f)| для № 2.2" title="" id="28" name="Picture"/>
+            <wp:docPr descr="" title="" id="24" name="Picture"/>
             <a:graphic>
               <a:graphicData uri="http://schemas.openxmlformats.org/drawingml/2006/picture">
                 <pic:pic>
                   <pic:nvPicPr>
-                    <pic:cNvPr descr="fig/z2_2.png" id="29" name="Picture"/>
+                    <pic:cNvPr descr="fig/z2_2.png" id="25" name="Picture"/>
                     <pic:cNvPicPr>
                       <a:picLocks noChangeArrowheads="1" noChangeAspect="1"/>
                     </pic:cNvPicPr>
                   </pic:nvPicPr>
                   <pic:blipFill>
-                    <a:blip r:embed="rId27"/>
+                    <a:blip r:embed="rId23"/>
                     <a:stretch>
                       <a:fillRect/>
                     </a:stretch>
@@ -5887,33 +5212,15 @@
     </w:p>
     <w:p>
       <w:pPr>
-        <w:pStyle w:val="ImageCaption"/>
-      </w:pPr>
-      <w:r>
-        <w:t xml:space="preserve">|Y(f)| для № 2.2</w:t>
-      </w:r>
-    </w:p>
-    <w:bookmarkEnd w:id="30"/>
-    <w:bookmarkStart w:id="34" w:name="section-4"/>
-    <w:p>
-      <w:pPr>
         <w:pageBreakBefore/>
-        <w:pStyle w:val="Heading2"/>
-      </w:pPr>
-      <w:r>
-        <w:t xml:space="preserve">№ 2.3</w:t>
-      </w:r>
-    </w:p>
-    <w:p>
-      <w:pPr>
-        <w:pStyle w:val="FirstParagraph"/>
+        <w:pStyle w:val="BodyText"/>
       </w:pPr>
       <w:r>
         <w:rPr>
           <w:bCs/>
           <w:b/>
         </w:rPr>
-        <w:t xml:space="preserve">Условие.</w:t>
+        <w:t xml:space="preserve">№ 2.3.</w:t>
       </w:r>
       <w:r>
         <w:t xml:space="preserve"> </w:t>
@@ -6270,18 +5577,6 @@
       </w:r>
       <w:r>
         <w:t xml:space="preserve">с.</w:t>
-      </w:r>
-    </w:p>
-    <w:p>
-      <w:pPr>
-        <w:pStyle w:val="BodyText"/>
-      </w:pPr>
-      <w:r>
-        <w:rPr>
-          <w:bCs/>
-          <w:b/>
-        </w:rPr>
-        <w:t xml:space="preserve">Решение.</w:t>
       </w:r>
     </w:p>
     <w:p>
@@ -7416,25 +6711,25 @@
     </w:p>
     <w:p>
       <w:pPr>
-        <w:pStyle w:val="CaptionedFigure"/>
+        <w:pStyle w:val="BodyText"/>
       </w:pPr>
       <w:r>
         <w:drawing>
           <wp:inline>
             <wp:extent cx="4319999" cy="3023999"/>
             <wp:effectExtent b="0" l="0" r="0" t="0"/>
-            <wp:docPr descr="Спектры № 2.3" title="" id="32" name="Picture"/>
+            <wp:docPr descr="" title="" id="27" name="Picture"/>
             <a:graphic>
               <a:graphicData uri="http://schemas.openxmlformats.org/drawingml/2006/picture">
                 <pic:pic>
                   <pic:nvPicPr>
-                    <pic:cNvPr descr="fig/z2_3.png" id="33" name="Picture"/>
+                    <pic:cNvPr descr="fig/z2_3.png" id="28" name="Picture"/>
                     <pic:cNvPicPr>
                       <a:picLocks noChangeArrowheads="1" noChangeAspect="1"/>
                     </pic:cNvPicPr>
                   </pic:nvPicPr>
                   <pic:blipFill>
-                    <a:blip r:embed="rId31"/>
+                    <a:blip r:embed="rId26"/>
                     <a:stretch>
                       <a:fillRect/>
                     </a:stretch>
@@ -7463,33 +6758,15 @@
     </w:p>
     <w:p>
       <w:pPr>
-        <w:pStyle w:val="ImageCaption"/>
-      </w:pPr>
-      <w:r>
-        <w:t xml:space="preserve">Спектры № 2.3</w:t>
-      </w:r>
-    </w:p>
-    <w:bookmarkEnd w:id="34"/>
-    <w:bookmarkStart w:id="38" w:name="section-5"/>
-    <w:p>
-      <w:pPr>
         <w:pageBreakBefore/>
-        <w:pStyle w:val="Heading2"/>
-      </w:pPr>
-      <w:r>
-        <w:t xml:space="preserve">№ 2.4</w:t>
-      </w:r>
-    </w:p>
-    <w:p>
-      <w:pPr>
-        <w:pStyle w:val="FirstParagraph"/>
+        <w:pStyle w:val="BodyText"/>
       </w:pPr>
       <w:r>
         <w:rPr>
           <w:bCs/>
           <w:b/>
         </w:rPr>
-        <w:t xml:space="preserve">Условие.</w:t>
+        <w:t xml:space="preserve">№ 2.4.</w:t>
       </w:r>
       <w:r>
         <w:t xml:space="preserve"> </w:t>
@@ -7782,18 +7059,6 @@
       </w:r>
       <w:r>
         <w:t xml:space="preserve">с. Найти спектр наблюдаемого участка сигнала.</w:t>
-      </w:r>
-    </w:p>
-    <w:p>
-      <w:pPr>
-        <w:pStyle w:val="BodyText"/>
-      </w:pPr>
-      <w:r>
-        <w:rPr>
-          <w:bCs/>
-          <w:b/>
-        </w:rPr>
-        <w:t xml:space="preserve">Решение.</w:t>
       </w:r>
     </w:p>
     <w:p>
@@ -8854,25 +8119,25 @@
     </w:p>
     <w:p>
       <w:pPr>
-        <w:pStyle w:val="CaptionedFigure"/>
+        <w:pStyle w:val="BodyText"/>
       </w:pPr>
       <w:r>
         <w:drawing>
           <wp:inline>
             <wp:extent cx="4859999" cy="1943999"/>
             <wp:effectExtent b="0" l="0" r="0" t="0"/>
-            <wp:docPr descr="|Y(f)| для № 2.4" title="" id="36" name="Picture"/>
+            <wp:docPr descr="" title="" id="30" name="Picture"/>
             <a:graphic>
               <a:graphicData uri="http://schemas.openxmlformats.org/drawingml/2006/picture">
                 <pic:pic>
                   <pic:nvPicPr>
-                    <pic:cNvPr descr="fig/z2_4.png" id="37" name="Picture"/>
+                    <pic:cNvPr descr="fig/z2_4.png" id="31" name="Picture"/>
                     <pic:cNvPicPr>
                       <a:picLocks noChangeArrowheads="1" noChangeAspect="1"/>
                     </pic:cNvPicPr>
                   </pic:nvPicPr>
                   <pic:blipFill>
-                    <a:blip r:embed="rId35"/>
+                    <a:blip r:embed="rId29"/>
                     <a:stretch>
                       <a:fillRect/>
                     </a:stretch>
@@ -8901,33 +8166,15 @@
     </w:p>
     <w:p>
       <w:pPr>
-        <w:pStyle w:val="ImageCaption"/>
-      </w:pPr>
-      <w:r>
-        <w:t xml:space="preserve">|Y(f)| для № 2.4</w:t>
-      </w:r>
-    </w:p>
-    <w:bookmarkEnd w:id="38"/>
-    <w:bookmarkStart w:id="42" w:name="section-6"/>
-    <w:p>
-      <w:pPr>
         <w:pageBreakBefore/>
-        <w:pStyle w:val="Heading2"/>
-      </w:pPr>
-      <w:r>
-        <w:t xml:space="preserve">№ 2.5</w:t>
-      </w:r>
-    </w:p>
-    <w:p>
-      <w:pPr>
-        <w:pStyle w:val="FirstParagraph"/>
+        <w:pStyle w:val="BodyText"/>
       </w:pPr>
       <w:r>
         <w:rPr>
           <w:bCs/>
           <w:b/>
         </w:rPr>
-        <w:t xml:space="preserve">Условие.</w:t>
+        <w:t xml:space="preserve">№ 2.5.</w:t>
       </w:r>
       <w:r>
         <w:t xml:space="preserve"> </w:t>
@@ -9559,18 +8806,6 @@
       </m:oMath>
       <w:r>
         <w:t xml:space="preserve">.</w:t>
-      </w:r>
-    </w:p>
-    <w:p>
-      <w:pPr>
-        <w:pStyle w:val="BodyText"/>
-      </w:pPr>
-      <w:r>
-        <w:rPr>
-          <w:bCs/>
-          <w:b/>
-        </w:rPr>
-        <w:t xml:space="preserve">Решение.</w:t>
       </w:r>
     </w:p>
     <w:p>
@@ -10074,25 +9309,25 @@
     </w:p>
     <w:p>
       <w:pPr>
-        <w:pStyle w:val="CaptionedFigure"/>
+        <w:pStyle w:val="BodyText"/>
       </w:pPr>
       <w:r>
         <w:drawing>
           <wp:inline>
             <wp:extent cx="4859999" cy="1727999"/>
             <wp:effectExtent b="0" l="0" r="0" t="0"/>
-            <wp:docPr descr="АЧХ и ФЧХ одностороннего экспоненциального импульса" title="" id="40" name="Picture"/>
+            <wp:docPr descr="" title="" id="33" name="Picture"/>
             <a:graphic>
               <a:graphicData uri="http://schemas.openxmlformats.org/drawingml/2006/picture">
                 <pic:pic>
                   <pic:nvPicPr>
-                    <pic:cNvPr descr="fig/z2_5.png" id="41" name="Picture"/>
+                    <pic:cNvPr descr="fig/z2_5.png" id="34" name="Picture"/>
                     <pic:cNvPicPr>
                       <a:picLocks noChangeArrowheads="1" noChangeAspect="1"/>
                     </pic:cNvPicPr>
                   </pic:nvPicPr>
                   <pic:blipFill>
-                    <a:blip r:embed="rId39"/>
+                    <a:blip r:embed="rId32"/>
                     <a:stretch>
                       <a:fillRect/>
                     </a:stretch>
@@ -10117,14 +9352,6 @@
             </a:graphic>
           </wp:inline>
         </w:drawing>
-      </w:r>
-    </w:p>
-    <w:p>
-      <w:pPr>
-        <w:pStyle w:val="ImageCaption"/>
-      </w:pPr>
-      <w:r>
-        <w:t xml:space="preserve">АЧХ и ФЧХ одностороннего экспоненциального импульса</w:t>
       </w:r>
     </w:p>
     <w:p>
@@ -11174,27 +10401,17 @@
         <w:t xml:space="preserve">.</w:t>
       </w:r>
     </w:p>
-    <w:bookmarkEnd w:id="42"/>
-    <w:bookmarkStart w:id="43" w:name="section-7"/>
     <w:p>
       <w:pPr>
         <w:pageBreakBefore/>
-        <w:pStyle w:val="Heading2"/>
-      </w:pPr>
-      <w:r>
-        <w:t xml:space="preserve">№ 2.6</w:t>
-      </w:r>
-    </w:p>
-    <w:p>
-      <w:pPr>
-        <w:pStyle w:val="FirstParagraph"/>
+        <w:pStyle w:val="BodyText"/>
       </w:pPr>
       <w:r>
         <w:rPr>
           <w:bCs/>
           <w:b/>
         </w:rPr>
-        <w:t xml:space="preserve">Условие.</w:t>
+        <w:t xml:space="preserve">№ 2.6.</w:t>
       </w:r>
       <w:r>
         <w:t xml:space="preserve"> </w:t>
@@ -11475,18 +10692,6 @@
       </m:oMath>
       <w:r>
         <w:t xml:space="preserve">.</w:t>
-      </w:r>
-    </w:p>
-    <w:p>
-      <w:pPr>
-        <w:pStyle w:val="BodyText"/>
-      </w:pPr>
-      <w:r>
-        <w:rPr>
-          <w:bCs/>
-          <w:b/>
-        </w:rPr>
-        <w:t xml:space="preserve">Решение.</w:t>
       </w:r>
     </w:p>
     <w:p>
@@ -12551,27 +11756,17 @@
         <w:t xml:space="preserve">.)</w:t>
       </w:r>
     </w:p>
-    <w:bookmarkEnd w:id="43"/>
-    <w:bookmarkStart w:id="47" w:name="section-8"/>
     <w:p>
       <w:pPr>
         <w:pageBreakBefore/>
-        <w:pStyle w:val="Heading2"/>
-      </w:pPr>
-      <w:r>
-        <w:t xml:space="preserve">№ 2.7</w:t>
-      </w:r>
-    </w:p>
-    <w:p>
-      <w:pPr>
-        <w:pStyle w:val="FirstParagraph"/>
+        <w:pStyle w:val="BodyText"/>
       </w:pPr>
       <w:r>
         <w:rPr>
           <w:bCs/>
           <w:b/>
         </w:rPr>
-        <w:t xml:space="preserve">Условие.</w:t>
+        <w:t xml:space="preserve">№ 2.7.</w:t>
       </w:r>
       <w:r>
         <w:t xml:space="preserve"> </w:t>
@@ -12679,18 +11874,6 @@
       </w:r>
       <w:r>
         <w:t xml:space="preserve">мкс.</w:t>
-      </w:r>
-    </w:p>
-    <w:p>
-      <w:pPr>
-        <w:pStyle w:val="BodyText"/>
-      </w:pPr>
-      <w:r>
-        <w:rPr>
-          <w:bCs/>
-          <w:b/>
-        </w:rPr>
-        <w:t xml:space="preserve">Решение.</w:t>
       </w:r>
     </w:p>
     <w:p>
@@ -13849,25 +13032,25 @@
     </w:p>
     <w:p>
       <w:pPr>
-        <w:pStyle w:val="CaptionedFigure"/>
+        <w:pStyle w:val="FirstParagraph"/>
       </w:pPr>
       <w:r>
         <w:drawing>
           <wp:inline>
             <wp:extent cx="4859999" cy="1835999"/>
             <wp:effectExtent b="0" l="0" r="0" t="0"/>
-            <wp:docPr descr="|X(f)| пачки из трёх импульсов" title="" id="45" name="Picture"/>
+            <wp:docPr descr="" title="" id="36" name="Picture"/>
             <a:graphic>
               <a:graphicData uri="http://schemas.openxmlformats.org/drawingml/2006/picture">
                 <pic:pic>
                   <pic:nvPicPr>
-                    <pic:cNvPr descr="fig/z2_7.png" id="46" name="Picture"/>
+                    <pic:cNvPr descr="fig/z2_7.png" id="37" name="Picture"/>
                     <pic:cNvPicPr>
                       <a:picLocks noChangeArrowheads="1" noChangeAspect="1"/>
                     </pic:cNvPicPr>
                   </pic:nvPicPr>
                   <pic:blipFill>
-                    <a:blip r:embed="rId44"/>
+                    <a:blip r:embed="rId35"/>
                     <a:stretch>
                       <a:fillRect/>
                     </a:stretch>
@@ -13896,33 +13079,15 @@
     </w:p>
     <w:p>
       <w:pPr>
-        <w:pStyle w:val="ImageCaption"/>
-      </w:pPr>
-      <w:r>
-        <w:t xml:space="preserve">|X(f)| пачки из трёх импульсов</w:t>
-      </w:r>
-    </w:p>
-    <w:bookmarkEnd w:id="47"/>
-    <w:bookmarkStart w:id="48" w:name="section-9"/>
-    <w:p>
-      <w:pPr>
         <w:pageBreakBefore/>
-        <w:pStyle w:val="Heading2"/>
-      </w:pPr>
-      <w:r>
-        <w:t xml:space="preserve">№ 2.8</w:t>
-      </w:r>
-    </w:p>
-    <w:p>
-      <w:pPr>
-        <w:pStyle w:val="FirstParagraph"/>
+        <w:pStyle w:val="BodyText"/>
       </w:pPr>
       <w:r>
         <w:rPr>
           <w:bCs/>
           <w:b/>
         </w:rPr>
-        <w:t xml:space="preserve">Условие.</w:t>
+        <w:t xml:space="preserve">№ 2.8.</w:t>
       </w:r>
       <w:r>
         <w:t xml:space="preserve"> </w:t>
@@ -14076,18 +13241,6 @@
       </w:r>
       <w:r>
         <w:t xml:space="preserve">кГц.</w:t>
-      </w:r>
-    </w:p>
-    <w:p>
-      <w:pPr>
-        <w:pStyle w:val="BodyText"/>
-      </w:pPr>
-      <w:r>
-        <w:rPr>
-          <w:bCs/>
-          <w:b/>
-        </w:rPr>
-        <w:t xml:space="preserve">Решение.</w:t>
       </w:r>
     </w:p>
     <w:p>
@@ -14837,45 +13990,23 @@
         <w:t xml:space="preserve">кГц (то же получается из теоремы о спектре произведения).</w:t>
       </w:r>
     </w:p>
-    <w:bookmarkEnd w:id="48"/>
-    <w:bookmarkStart w:id="49" w:name="section-10"/>
     <w:p>
       <w:pPr>
         <w:pageBreakBefore/>
-        <w:pStyle w:val="Heading2"/>
-      </w:pPr>
-      <w:r>
-        <w:t xml:space="preserve">№ 2.9</w:t>
-      </w:r>
-    </w:p>
-    <w:p>
-      <w:pPr>
-        <w:pStyle w:val="FirstParagraph"/>
+        <w:pStyle w:val="BodyText"/>
       </w:pPr>
       <w:r>
         <w:rPr>
           <w:bCs/>
           <w:b/>
         </w:rPr>
-        <w:t xml:space="preserve">Условие.</w:t>
+        <w:t xml:space="preserve">№ 2.9.</w:t>
       </w:r>
       <w:r>
         <w:t xml:space="preserve"> </w:t>
       </w:r>
       <w:r>
         <w:t xml:space="preserve">Сформулировать и доказать свойства преобразования Фурье: а) теорему запаздывания; б) теорему смещения; в) теорему об изменении масштаба; г) теорему о спектре производной; д) теорему о производной спектра.</w:t>
-      </w:r>
-    </w:p>
-    <w:p>
-      <w:pPr>
-        <w:pStyle w:val="BodyText"/>
-      </w:pPr>
-      <w:r>
-        <w:rPr>
-          <w:bCs/>
-          <w:b/>
-        </w:rPr>
-        <w:t xml:space="preserve">Решение.</w:t>
       </w:r>
     </w:p>
     <w:p>
@@ -17263,19 +16394,9 @@
         </m:oMath>
       </m:oMathPara>
     </w:p>
-    <w:bookmarkEnd w:id="49"/>
-    <w:bookmarkStart w:id="50" w:name="section-11"/>
     <w:p>
       <w:pPr>
         <w:pageBreakBefore/>
-        <w:pStyle w:val="Heading2"/>
-      </w:pPr>
-      <w:r>
-        <w:t xml:space="preserve">№ 2.10</w:t>
-      </w:r>
-    </w:p>
-    <w:p>
-      <w:pPr>
         <w:pStyle w:val="FirstParagraph"/>
       </w:pPr>
       <w:r>
@@ -17283,7 +16404,7 @@
           <w:bCs/>
           <w:b/>
         </w:rPr>
-        <w:t xml:space="preserve">Условие.</w:t>
+        <w:t xml:space="preserve">№ 2.10.</w:t>
       </w:r>
       <w:r>
         <w:t xml:space="preserve"> </w:t>
@@ -17997,18 +17118,6 @@
       </m:oMath>
       <w:r>
         <w:t xml:space="preserve">. (Вне указанных интервалов сигналы равны нулю.)</w:t>
-      </w:r>
-    </w:p>
-    <w:p>
-      <w:pPr>
-        <w:pStyle w:val="BodyText"/>
-      </w:pPr>
-      <w:r>
-        <w:rPr>
-          <w:bCs/>
-          <w:b/>
-        </w:rPr>
-        <w:t xml:space="preserve">Решение.</w:t>
       </w:r>
     </w:p>
     <w:p>
@@ -20577,37 +19686,17 @@
         <w:t xml:space="preserve">.</w:t>
       </w:r>
     </w:p>
-    <w:bookmarkEnd w:id="50"/>
-    <w:bookmarkEnd w:id="51"/>
-    <w:bookmarkStart w:id="84" w:name="модуль-3"/>
     <w:p>
       <w:pPr>
         <w:pageBreakBefore/>
-        <w:pStyle w:val="Heading1"/>
-      </w:pPr>
-      <w:r>
-        <w:t xml:space="preserve">Модуль 3</w:t>
-      </w:r>
-    </w:p>
-    <w:bookmarkStart w:id="52" w:name="section-12"/>
-    <w:p>
-      <w:pPr>
-        <w:pStyle w:val="Heading2"/>
-      </w:pPr>
-      <w:r>
-        <w:t xml:space="preserve">№ 3.1</w:t>
-      </w:r>
-    </w:p>
-    <w:p>
-      <w:pPr>
-        <w:pStyle w:val="FirstParagraph"/>
+        <w:pStyle w:val="BodyText"/>
       </w:pPr>
       <w:r>
         <w:rPr>
           <w:bCs/>
           <w:b/>
         </w:rPr>
-        <w:t xml:space="preserve">Условие.</w:t>
+        <w:t xml:space="preserve">№ 3.1.</w:t>
       </w:r>
       <w:r>
         <w:t xml:space="preserve"> </w:t>
@@ -21097,18 +20186,6 @@
         <w:pStyle w:val="BodyText"/>
       </w:pPr>
       <w:r>
-        <w:rPr>
-          <w:bCs/>
-          <w:b/>
-        </w:rPr>
-        <w:t xml:space="preserve">Решение.</w:t>
-      </w:r>
-    </w:p>
-    <w:p>
-      <w:pPr>
-        <w:pStyle w:val="BodyText"/>
-      </w:pPr>
-      <w:r>
         <w:t xml:space="preserve">Условие:</w:t>
       </w:r>
       <w:r>
@@ -22316,27 +21393,17 @@
         <w:t xml:space="preserve">Оба способа дают одинаковый результат.</w:t>
       </w:r>
     </w:p>
-    <w:bookmarkEnd w:id="52"/>
-    <w:bookmarkStart w:id="53" w:name="section-13"/>
     <w:p>
       <w:pPr>
         <w:pageBreakBefore/>
-        <w:pStyle w:val="Heading2"/>
-      </w:pPr>
-      <w:r>
-        <w:t xml:space="preserve">№ 3.2</w:t>
-      </w:r>
-    </w:p>
-    <w:p>
-      <w:pPr>
-        <w:pStyle w:val="FirstParagraph"/>
+        <w:pStyle w:val="BodyText"/>
       </w:pPr>
       <w:r>
         <w:rPr>
           <w:bCs/>
           <w:b/>
         </w:rPr>
-        <w:t xml:space="preserve">Условие.</w:t>
+        <w:t xml:space="preserve">№ 3.2.</w:t>
       </w:r>
       <w:r>
         <w:t xml:space="preserve"> </w:t>
@@ -22678,18 +21745,6 @@
         <w:pStyle w:val="BodyText"/>
       </w:pPr>
       <w:r>
-        <w:rPr>
-          <w:bCs/>
-          <w:b/>
-        </w:rPr>
-        <w:t xml:space="preserve">Решение.</w:t>
-      </w:r>
-    </w:p>
-    <w:p>
-      <w:pPr>
-        <w:pStyle w:val="BodyText"/>
-      </w:pPr>
-      <w:r>
         <w:t xml:space="preserve">Спектр функции отсчётов (51):</w:t>
       </w:r>
       <w:r>
@@ -24143,27 +23198,17 @@
         <w:t xml:space="preserve">.</w:t>
       </w:r>
     </w:p>
-    <w:bookmarkEnd w:id="53"/>
-    <w:bookmarkStart w:id="54" w:name="section-14"/>
     <w:p>
       <w:pPr>
         <w:pageBreakBefore/>
-        <w:pStyle w:val="Heading2"/>
-      </w:pPr>
-      <w:r>
-        <w:t xml:space="preserve">№ 3.3</w:t>
-      </w:r>
-    </w:p>
-    <w:p>
-      <w:pPr>
-        <w:pStyle w:val="FirstParagraph"/>
+        <w:pStyle w:val="BodyText"/>
       </w:pPr>
       <w:r>
         <w:rPr>
           <w:bCs/>
           <w:b/>
         </w:rPr>
-        <w:t xml:space="preserve">Условие.</w:t>
+        <w:t xml:space="preserve">№ 3.3.</w:t>
       </w:r>
       <w:r>
         <w:t xml:space="preserve"> </w:t>
@@ -24266,18 +23311,6 @@
       </w:r>
       <w:r>
         <w:t xml:space="preserve">кГц. Будет ли наблюдаться эффект наложения?</w:t>
-      </w:r>
-    </w:p>
-    <w:p>
-      <w:pPr>
-        <w:pStyle w:val="BodyText"/>
-      </w:pPr>
-      <w:r>
-        <w:rPr>
-          <w:bCs/>
-          <w:b/>
-        </w:rPr>
-        <w:t xml:space="preserve">Решение.</w:t>
       </w:r>
     </w:p>
     <w:p>
@@ -24608,27 +23641,17 @@
         <w:t xml:space="preserve">синусоиды неразличимы; для сигнала 80 кГц наблюдается эффект наложения (он «отображается» на частоту 20 кГц).</w:t>
       </w:r>
     </w:p>
-    <w:bookmarkEnd w:id="54"/>
-    <w:bookmarkStart w:id="55" w:name="section-15"/>
     <w:p>
       <w:pPr>
         <w:pageBreakBefore/>
-        <w:pStyle w:val="Heading2"/>
-      </w:pPr>
-      <w:r>
-        <w:t xml:space="preserve">№ 3.4</w:t>
-      </w:r>
-    </w:p>
-    <w:p>
-      <w:pPr>
-        <w:pStyle w:val="FirstParagraph"/>
+        <w:pStyle w:val="BodyText"/>
       </w:pPr>
       <w:r>
         <w:rPr>
           <w:bCs/>
           <w:b/>
         </w:rPr>
-        <w:t xml:space="preserve">Условие.</w:t>
+        <w:t xml:space="preserve">№ 3.4.</w:t>
       </w:r>
       <w:r>
         <w:t xml:space="preserve"> </w:t>
@@ -24991,18 +24014,6 @@
       </w:r>
       <w:r>
         <w:t xml:space="preserve">кГц. Установить для каждого из этих сигналов, будет ли наблюдаться эффект наложения.</w:t>
-      </w:r>
-    </w:p>
-    <w:p>
-      <w:pPr>
-        <w:pStyle w:val="BodyText"/>
-      </w:pPr>
-      <w:r>
-        <w:rPr>
-          <w:bCs/>
-          <w:b/>
-        </w:rPr>
-        <w:t xml:space="preserve">Решение.</w:t>
       </w:r>
     </w:p>
     <w:p>
@@ -25546,27 +24557,17 @@
         </w:tc>
       </w:tr>
     </w:tbl>
-    <w:bookmarkEnd w:id="55"/>
-    <w:bookmarkStart w:id="56" w:name="section-16"/>
     <w:p>
       <w:pPr>
         <w:pageBreakBefore/>
-        <w:pStyle w:val="Heading2"/>
-      </w:pPr>
-      <w:r>
-        <w:t xml:space="preserve">№ 3.5</w:t>
-      </w:r>
-    </w:p>
-    <w:p>
-      <w:pPr>
-        <w:pStyle w:val="FirstParagraph"/>
+        <w:pStyle w:val="BodyText"/>
       </w:pPr>
       <w:r>
         <w:rPr>
           <w:bCs/>
           <w:b/>
         </w:rPr>
-        <w:t xml:space="preserve">Условие.</w:t>
+        <w:t xml:space="preserve">№ 3.5.</w:t>
       </w:r>
       <w:r>
         <w:t xml:space="preserve"> </w:t>
@@ -25640,18 +24641,6 @@
       </m:oMath>
       <w:r>
         <w:t xml:space="preserve">.</w:t>
-      </w:r>
-    </w:p>
-    <w:p>
-      <w:pPr>
-        <w:pStyle w:val="BodyText"/>
-      </w:pPr>
-      <w:r>
-        <w:rPr>
-          <w:bCs/>
-          <w:b/>
-        </w:rPr>
-        <w:t xml:space="preserve">Решение.</w:t>
       </w:r>
     </w:p>
     <w:p>
@@ -26216,19 +25205,9 @@
         </m:oMath>
       </m:oMathPara>
     </w:p>
-    <w:bookmarkEnd w:id="56"/>
-    <w:bookmarkStart w:id="60" w:name="section-17"/>
     <w:p>
       <w:pPr>
         <w:pageBreakBefore/>
-        <w:pStyle w:val="Heading2"/>
-      </w:pPr>
-      <w:r>
-        <w:t xml:space="preserve">№ 3.6</w:t>
-      </w:r>
-    </w:p>
-    <w:p>
-      <w:pPr>
         <w:pStyle w:val="FirstParagraph"/>
       </w:pPr>
       <w:r>
@@ -26236,7 +25215,7 @@
           <w:bCs/>
           <w:b/>
         </w:rPr>
-        <w:t xml:space="preserve">Условие.</w:t>
+        <w:t xml:space="preserve">№ 3.6.</w:t>
       </w:r>
       <w:r>
         <w:t xml:space="preserve"> </w:t>
@@ -26374,18 +25353,6 @@
       </m:oMath>
       <w:r>
         <w:t xml:space="preserve">. Определить частоту дискретизации, необходимую для возможности его последующего точного восстановления.</w:t>
-      </w:r>
-    </w:p>
-    <w:p>
-      <w:pPr>
-        <w:pStyle w:val="BodyText"/>
-      </w:pPr>
-      <w:r>
-        <w:rPr>
-          <w:bCs/>
-          <w:b/>
-        </w:rPr>
-        <w:t xml:space="preserve">Решение.</w:t>
       </w:r>
     </w:p>
     <w:p>
@@ -27235,25 +26202,25 @@
     </w:p>
     <w:p>
       <w:pPr>
-        <w:pStyle w:val="CaptionedFigure"/>
+        <w:pStyle w:val="BodyText"/>
       </w:pPr>
       <w:r>
         <w:drawing>
           <wp:inline>
             <wp:extent cx="4859999" cy="1943999"/>
             <wp:effectExtent b="0" l="0" r="0" t="0"/>
-            <wp:docPr descr="Спектр периодического сигнала № 3.6" title="" id="58" name="Picture"/>
+            <wp:docPr descr="" title="" id="39" name="Picture"/>
             <a:graphic>
               <a:graphicData uri="http://schemas.openxmlformats.org/drawingml/2006/picture">
                 <pic:pic>
                   <pic:nvPicPr>
-                    <pic:cNvPr descr="fig/z3_6.png" id="59" name="Picture"/>
+                    <pic:cNvPr descr="fig/z3_6.png" id="40" name="Picture"/>
                     <pic:cNvPicPr>
                       <a:picLocks noChangeArrowheads="1" noChangeAspect="1"/>
                     </pic:cNvPicPr>
                   </pic:nvPicPr>
                   <pic:blipFill>
-                    <a:blip r:embed="rId57"/>
+                    <a:blip r:embed="rId38"/>
                     <a:stretch>
                       <a:fillRect/>
                     </a:stretch>
@@ -27282,14 +26249,6 @@
     </w:p>
     <w:p>
       <w:pPr>
-        <w:pStyle w:val="ImageCaption"/>
-      </w:pPr>
-      <w:r>
-        <w:t xml:space="preserve">Спектр периодического сигнала № 3.6</w:t>
-      </w:r>
-    </w:p>
-    <w:p>
-      <w:pPr>
         <w:pStyle w:val="BodyText"/>
       </w:pPr>
       <w:r>
@@ -27437,19 +26396,9 @@
         </m:oMath>
       </m:oMathPara>
     </w:p>
-    <w:bookmarkEnd w:id="60"/>
-    <w:bookmarkStart w:id="64" w:name="section-18"/>
     <w:p>
       <w:pPr>
         <w:pageBreakBefore/>
-        <w:pStyle w:val="Heading2"/>
-      </w:pPr>
-      <w:r>
-        <w:t xml:space="preserve">№ 3.7</w:t>
-      </w:r>
-    </w:p>
-    <w:p>
-      <w:pPr>
         <w:pStyle w:val="FirstParagraph"/>
       </w:pPr>
       <w:r>
@@ -27457,7 +26406,7 @@
           <w:bCs/>
           <w:b/>
         </w:rPr>
-        <w:t xml:space="preserve">Условие.</w:t>
+        <w:t xml:space="preserve">№ 3.7.</w:t>
       </w:r>
       <w:r>
         <w:t xml:space="preserve"> </w:t>
@@ -27557,18 +26506,6 @@
       </m:oMath>
       <w:r>
         <w:t xml:space="preserve">.</w:t>
-      </w:r>
-    </w:p>
-    <w:p>
-      <w:pPr>
-        <w:pStyle w:val="BodyText"/>
-      </w:pPr>
-      <w:r>
-        <w:rPr>
-          <w:bCs/>
-          <w:b/>
-        </w:rPr>
-        <w:t xml:space="preserve">Решение.</w:t>
       </w:r>
     </w:p>
     <w:p>
@@ -28761,25 +27698,25 @@
     </w:p>
     <w:p>
       <w:pPr>
-        <w:pStyle w:val="CaptionedFigure"/>
+        <w:pStyle w:val="FirstParagraph"/>
       </w:pPr>
       <w:r>
         <w:drawing>
           <wp:inline>
             <wp:extent cx="4319999" cy="3023999"/>
             <wp:effectExtent b="0" l="0" r="0" t="0"/>
-            <wp:docPr descr="Спектр группы из 2N+1 дельта-импульсов" title="" id="62" name="Picture"/>
+            <wp:docPr descr="" title="" id="42" name="Picture"/>
             <a:graphic>
               <a:graphicData uri="http://schemas.openxmlformats.org/drawingml/2006/picture">
                 <pic:pic>
                   <pic:nvPicPr>
-                    <pic:cNvPr descr="fig/z3_7.png" id="63" name="Picture"/>
+                    <pic:cNvPr descr="fig/z3_7.png" id="43" name="Picture"/>
                     <pic:cNvPicPr>
                       <a:picLocks noChangeArrowheads="1" noChangeAspect="1"/>
                     </pic:cNvPicPr>
                   </pic:nvPicPr>
                   <pic:blipFill>
-                    <a:blip r:embed="rId61"/>
+                    <a:blip r:embed="rId41"/>
                     <a:stretch>
                       <a:fillRect/>
                     </a:stretch>
@@ -28808,33 +27745,15 @@
     </w:p>
     <w:p>
       <w:pPr>
-        <w:pStyle w:val="ImageCaption"/>
-      </w:pPr>
-      <w:r>
-        <w:t xml:space="preserve">Спектр группы из 2N+1 дельта-импульсов</w:t>
-      </w:r>
-    </w:p>
-    <w:bookmarkEnd w:id="64"/>
-    <w:bookmarkStart w:id="68" w:name="section-19"/>
-    <w:p>
-      <w:pPr>
         <w:pageBreakBefore/>
-        <w:pStyle w:val="Heading2"/>
-      </w:pPr>
-      <w:r>
-        <w:t xml:space="preserve">№ 3.8</w:t>
-      </w:r>
-    </w:p>
-    <w:p>
-      <w:pPr>
-        <w:pStyle w:val="FirstParagraph"/>
+        <w:pStyle w:val="BodyText"/>
       </w:pPr>
       <w:r>
         <w:rPr>
           <w:bCs/>
           <w:b/>
         </w:rPr>
-        <w:t xml:space="preserve">Условие.</w:t>
+        <w:t xml:space="preserve">№ 3.8.</w:t>
       </w:r>
       <w:r>
         <w:t xml:space="preserve"> </w:t>
@@ -28961,18 +27880,6 @@
       </w:r>
       <w:r>
         <w:t xml:space="preserve">мкс. Найти и изобразить по модулю спектральную плотность дискретизованного сигнала.</w:t>
-      </w:r>
-    </w:p>
-    <w:p>
-      <w:pPr>
-        <w:pStyle w:val="BodyText"/>
-      </w:pPr>
-      <w:r>
-        <w:rPr>
-          <w:bCs/>
-          <w:b/>
-        </w:rPr>
-        <w:t xml:space="preserve">Решение.</w:t>
       </w:r>
     </w:p>
     <w:p>
@@ -30130,25 +29037,25 @@
     </w:p>
     <w:p>
       <w:pPr>
-        <w:pStyle w:val="CaptionedFigure"/>
+        <w:pStyle w:val="BodyText"/>
       </w:pPr>
       <w:r>
         <w:drawing>
           <wp:inline>
             <wp:extent cx="4859999" cy="2065499"/>
             <wp:effectExtent b="0" l="0" r="0" t="0"/>
-            <wp:docPr descr="Спектр дискретизованного экспоненциального импульса" title="" id="66" name="Picture"/>
+            <wp:docPr descr="" title="" id="45" name="Picture"/>
             <a:graphic>
               <a:graphicData uri="http://schemas.openxmlformats.org/drawingml/2006/picture">
                 <pic:pic>
                   <pic:nvPicPr>
-                    <pic:cNvPr descr="fig/z3_8.png" id="67" name="Picture"/>
+                    <pic:cNvPr descr="fig/z3_8.png" id="46" name="Picture"/>
                     <pic:cNvPicPr>
                       <a:picLocks noChangeArrowheads="1" noChangeAspect="1"/>
                     </pic:cNvPicPr>
                   </pic:nvPicPr>
                   <pic:blipFill>
-                    <a:blip r:embed="rId65"/>
+                    <a:blip r:embed="rId44"/>
                     <a:stretch>
                       <a:fillRect/>
                     </a:stretch>
@@ -30177,33 +29084,15 @@
     </w:p>
     <w:p>
       <w:pPr>
-        <w:pStyle w:val="ImageCaption"/>
-      </w:pPr>
-      <w:r>
-        <w:t xml:space="preserve">Спектр дискретизованного экспоненциального импульса</w:t>
-      </w:r>
-    </w:p>
-    <w:bookmarkEnd w:id="68"/>
-    <w:bookmarkStart w:id="72" w:name="section-20"/>
-    <w:p>
-      <w:pPr>
         <w:pageBreakBefore/>
-        <w:pStyle w:val="Heading2"/>
-      </w:pPr>
-      <w:r>
-        <w:t xml:space="preserve">№ 3.9</w:t>
-      </w:r>
-    </w:p>
-    <w:p>
-      <w:pPr>
-        <w:pStyle w:val="FirstParagraph"/>
+        <w:pStyle w:val="BodyText"/>
       </w:pPr>
       <w:r>
         <w:rPr>
           <w:bCs/>
           <w:b/>
         </w:rPr>
-        <w:t xml:space="preserve">Условие.</w:t>
+        <w:t xml:space="preserve">№ 3.9.</w:t>
       </w:r>
       <w:r>
         <w:t xml:space="preserve"> </w:t>
@@ -30270,18 +29159,6 @@
       </m:oMath>
       <w:r>
         <w:t xml:space="preserve">.</w:t>
-      </w:r>
-    </w:p>
-    <w:p>
-      <w:pPr>
-        <w:pStyle w:val="BodyText"/>
-      </w:pPr>
-      <w:r>
-        <w:rPr>
-          <w:bCs/>
-          <w:b/>
-        </w:rPr>
-        <w:t xml:space="preserve">Решение.</w:t>
       </w:r>
     </w:p>
     <w:p>
@@ -31910,25 +30787,25 @@
     </w:p>
     <w:p>
       <w:pPr>
-        <w:pStyle w:val="CaptionedFigure"/>
+        <w:pStyle w:val="BodyText"/>
       </w:pPr>
       <w:r>
         <w:drawing>
           <wp:inline>
             <wp:extent cx="4859999" cy="2065499"/>
             <wp:effectExtent b="0" l="0" r="0" t="0"/>
-            <wp:docPr descr="Спектр дискретизованного треугольного импульса" title="" id="70" name="Picture"/>
+            <wp:docPr descr="" title="" id="48" name="Picture"/>
             <a:graphic>
               <a:graphicData uri="http://schemas.openxmlformats.org/drawingml/2006/picture">
                 <pic:pic>
                   <pic:nvPicPr>
-                    <pic:cNvPr descr="fig/z3_9.png" id="71" name="Picture"/>
+                    <pic:cNvPr descr="fig/z3_9.png" id="49" name="Picture"/>
                     <pic:cNvPicPr>
                       <a:picLocks noChangeArrowheads="1" noChangeAspect="1"/>
                     </pic:cNvPicPr>
                   </pic:nvPicPr>
                   <pic:blipFill>
-                    <a:blip r:embed="rId69"/>
+                    <a:blip r:embed="rId47"/>
                     <a:stretch>
                       <a:fillRect/>
                     </a:stretch>
@@ -31957,33 +30834,15 @@
     </w:p>
     <w:p>
       <w:pPr>
-        <w:pStyle w:val="ImageCaption"/>
-      </w:pPr>
-      <w:r>
-        <w:t xml:space="preserve">Спектр дискретизованного треугольного импульса</w:t>
-      </w:r>
-    </w:p>
-    <w:bookmarkEnd w:id="72"/>
-    <w:bookmarkStart w:id="73" w:name="section-21"/>
-    <w:p>
-      <w:pPr>
         <w:pageBreakBefore/>
-        <w:pStyle w:val="Heading2"/>
-      </w:pPr>
-      <w:r>
-        <w:t xml:space="preserve">№ 3.10</w:t>
-      </w:r>
-    </w:p>
-    <w:p>
-      <w:pPr>
-        <w:pStyle w:val="FirstParagraph"/>
+        <w:pStyle w:val="BodyText"/>
       </w:pPr>
       <w:r>
         <w:rPr>
           <w:bCs/>
           <w:b/>
         </w:rPr>
-        <w:t xml:space="preserve">Условие.</w:t>
+        <w:t xml:space="preserve">№ 3.10.</w:t>
       </w:r>
       <w:r>
         <w:t xml:space="preserve"> </w:t>
@@ -32251,18 +31110,6 @@
       </m:oMath>
       <w:r>
         <w:t xml:space="preserve">.</w:t>
-      </w:r>
-    </w:p>
-    <w:p>
-      <w:pPr>
-        <w:pStyle w:val="BodyText"/>
-      </w:pPr>
-      <w:r>
-        <w:rPr>
-          <w:bCs/>
-          <w:b/>
-        </w:rPr>
-        <w:t xml:space="preserve">Решение.</w:t>
       </w:r>
     </w:p>
     <w:p>
@@ -33244,45 +32091,23 @@
         </w:tc>
       </w:tr>
     </w:tbl>
-    <w:bookmarkEnd w:id="73"/>
-    <w:bookmarkStart w:id="74" w:name="section-22"/>
     <w:p>
       <w:pPr>
         <w:pageBreakBefore/>
-        <w:pStyle w:val="Heading2"/>
-      </w:pPr>
-      <w:r>
-        <w:t xml:space="preserve">№ 3.11</w:t>
-      </w:r>
-    </w:p>
-    <w:p>
-      <w:pPr>
-        <w:pStyle w:val="FirstParagraph"/>
+        <w:pStyle w:val="BodyText"/>
       </w:pPr>
       <w:r>
         <w:rPr>
           <w:bCs/>
           <w:b/>
         </w:rPr>
-        <w:t xml:space="preserve">Условие.</w:t>
+        <w:t xml:space="preserve">№ 3.11.</w:t>
       </w:r>
       <w:r>
         <w:t xml:space="preserve"> </w:t>
       </w:r>
       <w:r>
         <w:t xml:space="preserve">Основываясь на теореме отсчётов, рассчитать полосу частот, необходимую для передачи чёрно-белого изображения, если принять, что разрешающая способность телевизионного изображения 500 строк с числом элементов в строке 650, скорость передачи 25 кадров в секунду и яркость каждой точки передаётся амплитудой видеосигнала.</w:t>
-      </w:r>
-    </w:p>
-    <w:p>
-      <w:pPr>
-        <w:pStyle w:val="BodyText"/>
-      </w:pPr>
-      <w:r>
-        <w:rPr>
-          <w:bCs/>
-          <w:b/>
-        </w:rPr>
-        <w:t xml:space="preserve">Решение.</w:t>
       </w:r>
     </w:p>
     <w:p>
@@ -33683,27 +32508,17 @@
         <w:t xml:space="preserve">МГц).</w:t>
       </w:r>
     </w:p>
-    <w:bookmarkEnd w:id="74"/>
-    <w:bookmarkStart w:id="75" w:name="section-23"/>
     <w:p>
       <w:pPr>
         <w:pageBreakBefore/>
-        <w:pStyle w:val="Heading2"/>
-      </w:pPr>
-      <w:r>
-        <w:t xml:space="preserve">№ 3.12</w:t>
-      </w:r>
-    </w:p>
-    <w:p>
-      <w:pPr>
-        <w:pStyle w:val="FirstParagraph"/>
+        <w:pStyle w:val="BodyText"/>
       </w:pPr>
       <w:r>
         <w:rPr>
           <w:bCs/>
           <w:b/>
         </w:rPr>
-        <w:t xml:space="preserve">Условие.</w:t>
+        <w:t xml:space="preserve">№ 3.12.</w:t>
       </w:r>
       <w:r>
         <w:t xml:space="preserve"> </w:t>
@@ -33904,18 +32719,6 @@
       </w:r>
       <w:r>
         <w:t xml:space="preserve">по отсчётным значениям.</w:t>
-      </w:r>
-    </w:p>
-    <w:p>
-      <w:pPr>
-        <w:pStyle w:val="BodyText"/>
-      </w:pPr>
-      <w:r>
-        <w:rPr>
-          <w:bCs/>
-          <w:b/>
-        </w:rPr>
-        <w:t xml:space="preserve">Решение.</w:t>
       </w:r>
     </w:p>
     <w:p>
@@ -35708,27 +34511,17 @@
         <w:t xml:space="preserve">) фазовый множитель исчезает.</w:t>
       </w:r>
     </w:p>
-    <w:bookmarkEnd w:id="75"/>
-    <w:bookmarkStart w:id="76" w:name="section-24"/>
     <w:p>
       <w:pPr>
         <w:pageBreakBefore/>
-        <w:pStyle w:val="Heading2"/>
-      </w:pPr>
-      <w:r>
-        <w:t xml:space="preserve">№ 3.13</w:t>
-      </w:r>
-    </w:p>
-    <w:p>
-      <w:pPr>
-        <w:pStyle w:val="FirstParagraph"/>
+        <w:pStyle w:val="BodyText"/>
       </w:pPr>
       <w:r>
         <w:rPr>
           <w:bCs/>
           <w:b/>
         </w:rPr>
-        <w:t xml:space="preserve">Условие.</w:t>
+        <w:t xml:space="preserve">№ 3.13.</w:t>
       </w:r>
       <w:r>
         <w:t xml:space="preserve"> </w:t>
@@ -35992,18 +34785,6 @@
         <w:pStyle w:val="BodyText"/>
       </w:pPr>
       <w:r>
-        <w:rPr>
-          <w:bCs/>
-          <w:b/>
-        </w:rPr>
-        <w:t xml:space="preserve">Решение.</w:t>
-      </w:r>
-    </w:p>
-    <w:p>
-      <w:pPr>
-        <w:pStyle w:val="BodyText"/>
-      </w:pPr>
-      <w:r>
         <w:t xml:space="preserve">Так как</w:t>
       </w:r>
       <w:r>
@@ -36926,27 +35707,17 @@
         <w:t xml:space="preserve">.)</w:t>
       </w:r>
     </w:p>
-    <w:bookmarkEnd w:id="76"/>
-    <w:bookmarkStart w:id="80" w:name="section-25"/>
     <w:p>
       <w:pPr>
         <w:pageBreakBefore/>
-        <w:pStyle w:val="Heading2"/>
-      </w:pPr>
-      <w:r>
-        <w:t xml:space="preserve">№ 3.14</w:t>
-      </w:r>
-    </w:p>
-    <w:p>
-      <w:pPr>
-        <w:pStyle w:val="FirstParagraph"/>
+        <w:pStyle w:val="BodyText"/>
       </w:pPr>
       <w:r>
         <w:rPr>
           <w:bCs/>
           <w:b/>
         </w:rPr>
-        <w:t xml:space="preserve">Условие.</w:t>
+        <w:t xml:space="preserve">№ 3.14.</w:t>
       </w:r>
       <w:r>
         <w:t xml:space="preserve"> </w:t>
@@ -37135,18 +35906,6 @@
       </m:oMath>
       <w:r>
         <w:t xml:space="preserve">, отметив все особые точки.</w:t>
-      </w:r>
-    </w:p>
-    <w:p>
-      <w:pPr>
-        <w:pStyle w:val="BodyText"/>
-      </w:pPr>
-      <w:r>
-        <w:rPr>
-          <w:bCs/>
-          <w:b/>
-        </w:rPr>
-        <w:t xml:space="preserve">Решение.</w:t>
       </w:r>
     </w:p>
     <w:p>
@@ -38415,25 +37174,25 @@
     </w:p>
     <w:p>
       <w:pPr>
-        <w:pStyle w:val="CaptionedFigure"/>
+        <w:pStyle w:val="FirstParagraph"/>
       </w:pPr>
       <w:r>
         <w:drawing>
           <wp:inline>
             <wp:extent cx="4859999" cy="2051999"/>
             <wp:effectExtent b="0" l="0" r="0" t="0"/>
-            <wp:docPr descr="Спектр дискретизованного прямоугольного импульса, 2N+1=9" title="" id="78" name="Picture"/>
+            <wp:docPr descr="" title="" id="51" name="Picture"/>
             <a:graphic>
               <a:graphicData uri="http://schemas.openxmlformats.org/drawingml/2006/picture">
                 <pic:pic>
                   <pic:nvPicPr>
-                    <pic:cNvPr descr="fig/z3_14.png" id="79" name="Picture"/>
+                    <pic:cNvPr descr="fig/z3_14.png" id="52" name="Picture"/>
                     <pic:cNvPicPr>
                       <a:picLocks noChangeArrowheads="1" noChangeAspect="1"/>
                     </pic:cNvPicPr>
                   </pic:nvPicPr>
                   <pic:blipFill>
-                    <a:blip r:embed="rId77"/>
+                    <a:blip r:embed="rId50"/>
                     <a:stretch>
                       <a:fillRect/>
                     </a:stretch>
@@ -38462,33 +37221,15 @@
     </w:p>
     <w:p>
       <w:pPr>
-        <w:pStyle w:val="ImageCaption"/>
-      </w:pPr>
-      <w:r>
-        <w:t xml:space="preserve">Спектр дискретизованного прямоугольного импульса, 2N+1=9</w:t>
-      </w:r>
-    </w:p>
-    <w:bookmarkEnd w:id="80"/>
-    <w:bookmarkStart w:id="81" w:name="section-26"/>
-    <w:p>
-      <w:pPr>
         <w:pageBreakBefore/>
-        <w:pStyle w:val="Heading2"/>
-      </w:pPr>
-      <w:r>
-        <w:t xml:space="preserve">№ 3.15</w:t>
-      </w:r>
-    </w:p>
-    <w:p>
-      <w:pPr>
-        <w:pStyle w:val="FirstParagraph"/>
+        <w:pStyle w:val="BodyText"/>
       </w:pPr>
       <w:r>
         <w:rPr>
           <w:bCs/>
           <w:b/>
         </w:rPr>
-        <w:t xml:space="preserve">Условие.</w:t>
+        <w:t xml:space="preserve">№ 3.15.</w:t>
       </w:r>
       <w:r>
         <w:t xml:space="preserve"> </w:t>
@@ -38590,18 +37331,6 @@
       </w:r>
       <w:r>
         <w:t xml:space="preserve">значения спектральной плотности не превышают 0,1 от максимального значения. Записать ряд Котельникова для этого случая.</w:t>
-      </w:r>
-    </w:p>
-    <w:p>
-      <w:pPr>
-        <w:pStyle w:val="BodyText"/>
-      </w:pPr>
-      <w:r>
-        <w:rPr>
-          <w:bCs/>
-          <w:b/>
-        </w:rPr>
-        <w:t xml:space="preserve">Решение.</w:t>
       </w:r>
     </w:p>
     <w:p>
@@ -40090,19 +38819,9 @@
         </m:oMath>
       </m:oMathPara>
     </w:p>
-    <w:bookmarkEnd w:id="81"/>
-    <w:bookmarkStart w:id="82" w:name="section-27"/>
     <w:p>
       <w:pPr>
         <w:pageBreakBefore/>
-        <w:pStyle w:val="Heading2"/>
-      </w:pPr>
-      <w:r>
-        <w:t xml:space="preserve">№ 3.16</w:t>
-      </w:r>
-    </w:p>
-    <w:p>
-      <w:pPr>
         <w:pStyle w:val="FirstParagraph"/>
       </w:pPr>
       <w:r>
@@ -40110,7 +38829,7 @@
           <w:bCs/>
           <w:b/>
         </w:rPr>
-        <w:t xml:space="preserve">Условие.</w:t>
+        <w:t xml:space="preserve">№ 3.16.</w:t>
       </w:r>
       <w:r>
         <w:t xml:space="preserve"> </w:t>
@@ -40224,18 +38943,6 @@
       </m:oMath>
       <w:r>
         <w:t xml:space="preserve">.</w:t>
-      </w:r>
-    </w:p>
-    <w:p>
-      <w:pPr>
-        <w:pStyle w:val="BodyText"/>
-      </w:pPr>
-      <w:r>
-        <w:rPr>
-          <w:bCs/>
-          <w:b/>
-        </w:rPr>
-        <w:t xml:space="preserve">Решение.</w:t>
       </w:r>
     </w:p>
     <w:p>
@@ -40751,19 +39458,9 @@
         </m:oMath>
       </m:oMathPara>
     </w:p>
-    <w:bookmarkEnd w:id="82"/>
-    <w:bookmarkStart w:id="83" w:name="section-28"/>
     <w:p>
       <w:pPr>
         <w:pageBreakBefore/>
-        <w:pStyle w:val="Heading2"/>
-      </w:pPr>
-      <w:r>
-        <w:t xml:space="preserve">№ 3.17</w:t>
-      </w:r>
-    </w:p>
-    <w:p>
-      <w:pPr>
         <w:pStyle w:val="FirstParagraph"/>
       </w:pPr>
       <w:r>
@@ -40771,7 +39468,7 @@
           <w:bCs/>
           <w:b/>
         </w:rPr>
-        <w:t xml:space="preserve">Условие.</w:t>
+        <w:t xml:space="preserve">№ 3.17.</w:t>
       </w:r>
       <w:r>
         <w:t xml:space="preserve"> </w:t>
@@ -40876,18 +39573,6 @@
       </w:r>
       <w:r>
         <w:t xml:space="preserve">значения спектральной плотности не превышают 0,1 от максимального значения. Записать ряд Котельникова для этого случая.</w:t>
-      </w:r>
-    </w:p>
-    <w:p>
-      <w:pPr>
-        <w:pStyle w:val="BodyText"/>
-      </w:pPr>
-      <w:r>
-        <w:rPr>
-          <w:bCs/>
-          <w:b/>
-        </w:rPr>
-        <w:t xml:space="preserve">Решение.</w:t>
       </w:r>
     </w:p>
     <w:p>
@@ -42488,8 +41173,6 @@
         </m:oMath>
       </m:oMathPara>
     </w:p>
-    <w:bookmarkEnd w:id="83"/>
-    <w:bookmarkEnd w:id="84"/>
     <w:sectPr>
       <w:pgSz w:h="16838" w:w="11906"/>
       <w:pgMar w:bottom="1134" w:footer="567" w:gutter="0" w:header="567" w:left="1418" w:right="1134" w:top="1134"/>

</xml_diff>